<commit_message>
Add CLAUDE docs, update sprint rules, add publish
Add CLAUDE.docx and CLAUDE.pdf and update CLAUDE.md with a new mandatory section requiring SPRINT-*.md updates whenever sprint tasks change (triggers, required fields, status mapping, responsibilities, and history entry format). Update docs/planning/SPRINT-todo-app-csharp-PLAN.md to include an Agent/Vai trò column in the update history. Replace/refresh related PDF planning/devops files. Add published Windows build outputs (TodoApp.ConsoleUI.exe and related .pdb files).
</commit_message>
<xml_diff>
--- a/docs/planning/SPRINT-todo-app-csharp-PLAN.docx
+++ b/docs/planning/SPRINT-todo-app-csharp-PLAN.docx
@@ -16259,14 +16259,15 @@
         <w:tblLook w:firstColumn="1" w:firstRow="1" w:lastColumn="0" w:lastRow="0" w:noHBand="0" w:noVBand="1" w:val="04A0"/>
       </w:tblPr>
       <w:tblGrid>
-        <w:gridCol w:w="3230"/>
-        <w:gridCol w:w="3230"/>
-        <w:gridCol w:w="3230"/>
+        <w:gridCol w:w="2422"/>
+        <w:gridCol w:w="2422"/>
+        <w:gridCol w:w="2422"/>
+        <w:gridCol w:w="2422"/>
       </w:tblGrid>
       <w:tr>
         <w:tc>
           <w:tcPr>
-            <w:tcW w:type="dxa" w:w="3230"/>
+            <w:tcW w:type="dxa" w:w="2422"/>
             <w:shd w:val="clear" w:color="auto" w:fill="251C53"/>
             <w:tcBorders>
               <w:top w:val="single" w:sz="4" w:space="0" w:color="251C53"/>
@@ -16288,7 +16289,7 @@
         </w:tc>
         <w:tc>
           <w:tcPr>
-            <w:tcW w:type="dxa" w:w="3230"/>
+            <w:tcW w:type="dxa" w:w="2422"/>
             <w:shd w:val="clear" w:color="auto" w:fill="251C53"/>
             <w:tcBorders>
               <w:top w:val="single" w:sz="4" w:space="0" w:color="251C53"/>
@@ -16310,7 +16311,7 @@
         </w:tc>
         <w:tc>
           <w:tcPr>
-            <w:tcW w:type="dxa" w:w="3230"/>
+            <w:tcW w:type="dxa" w:w="2422"/>
             <w:shd w:val="clear" w:color="auto" w:fill="251C53"/>
             <w:tcBorders>
               <w:top w:val="single" w:sz="4" w:space="0" w:color="251C53"/>
@@ -16330,11 +16331,33 @@
             </w:r>
           </w:p>
         </w:tc>
+        <w:tc>
+          <w:tcPr>
+            <w:tcW w:type="dxa" w:w="2422"/>
+            <w:shd w:val="clear" w:color="auto" w:fill="251C53"/>
+            <w:tcBorders>
+              <w:top w:val="single" w:sz="4" w:space="0" w:color="251C53"/>
+              <w:left w:val="single" w:sz="4" w:space="0" w:color="251C53"/>
+              <w:bottom w:val="single" w:sz="4" w:space="0" w:color="251C53"/>
+              <w:right w:val="single" w:sz="4" w:space="0" w:color="251C53"/>
+            </w:tcBorders>
+          </w:tcPr>
+          <w:p>
+            <w:r>
+              <w:rPr>
+                <w:b/>
+                <w:color w:val="FFFFFF"/>
+                <w:sz w:val="20"/>
+              </w:rPr>
+              <w:t>Agent/Vai trò</w:t>
+            </w:r>
+          </w:p>
+        </w:tc>
       </w:tr>
       <w:tr>
         <w:tc>
           <w:tcPr>
-            <w:tcW w:type="dxa" w:w="3230"/>
+            <w:tcW w:type="dxa" w:w="2422"/>
             <w:tcBorders>
               <w:top w:val="single" w:sz="4" w:space="0" w:color="CBCBCB"/>
               <w:left w:val="single" w:sz="4" w:space="0" w:color="CBCBCB"/>
@@ -16353,7 +16376,7 @@
         </w:tc>
         <w:tc>
           <w:tcPr>
-            <w:tcW w:type="dxa" w:w="3230"/>
+            <w:tcW w:type="dxa" w:w="2422"/>
             <w:tcBorders>
               <w:top w:val="single" w:sz="4" w:space="0" w:color="CBCBCB"/>
               <w:left w:val="single" w:sz="4" w:space="0" w:color="CBCBCB"/>
@@ -16372,7 +16395,7 @@
         </w:tc>
         <w:tc>
           <w:tcPr>
-            <w:tcW w:type="dxa" w:w="3230"/>
+            <w:tcW w:type="dxa" w:w="2422"/>
             <w:tcBorders>
               <w:top w:val="single" w:sz="4" w:space="0" w:color="CBCBCB"/>
               <w:left w:val="single" w:sz="4" w:space="0" w:color="CBCBCB"/>
@@ -16386,6 +16409,25 @@
                 <w:sz w:val="20"/>
               </w:rPr>
               <w:t>-------------------</w:t>
+            </w:r>
+          </w:p>
+        </w:tc>
+        <w:tc>
+          <w:tcPr>
+            <w:tcW w:type="dxa" w:w="2422"/>
+            <w:tcBorders>
+              <w:top w:val="single" w:sz="4" w:space="0" w:color="CBCBCB"/>
+              <w:left w:val="single" w:sz="4" w:space="0" w:color="CBCBCB"/>
+              <w:bottom w:val="single" w:sz="4" w:space="0" w:color="CBCBCB"/>
+              <w:right w:val="single" w:sz="4" w:space="0" w:color="CBCBCB"/>
+            </w:tcBorders>
+          </w:tcPr>
+          <w:p>
+            <w:r>
+              <w:rPr>
+                <w:sz w:val="20"/>
+              </w:rPr>
+              <w:t>---------------</w:t>
             </w:r>
           </w:p>
         </w:tc>
@@ -16393,7 +16435,7 @@
       <w:tr>
         <w:tc>
           <w:tcPr>
-            <w:tcW w:type="dxa" w:w="3230"/>
+            <w:tcW w:type="dxa" w:w="2422"/>
             <w:shd w:val="clear" w:color="auto" w:fill="B8B3D6"/>
             <w:tcBorders>
               <w:top w:val="single" w:sz="4" w:space="0" w:color="CBCBCB"/>
@@ -16413,7 +16455,7 @@
         </w:tc>
         <w:tc>
           <w:tcPr>
-            <w:tcW w:type="dxa" w:w="3230"/>
+            <w:tcW w:type="dxa" w:w="2422"/>
             <w:shd w:val="clear" w:color="auto" w:fill="B8B3D6"/>
             <w:tcBorders>
               <w:top w:val="single" w:sz="4" w:space="0" w:color="CBCBCB"/>
@@ -16433,7 +16475,7 @@
         </w:tc>
         <w:tc>
           <w:tcPr>
-            <w:tcW w:type="dxa" w:w="3230"/>
+            <w:tcW w:type="dxa" w:w="2422"/>
             <w:shd w:val="clear" w:color="auto" w:fill="B8B3D6"/>
             <w:tcBorders>
               <w:top w:val="single" w:sz="4" w:space="0" w:color="CBCBCB"/>
@@ -16448,6 +16490,26 @@
                 <w:sz w:val="20"/>
               </w:rPr>
               <w:t>Khởi tạo Sprint Plan — 3 sprints, 14 ngày</w:t>
+            </w:r>
+          </w:p>
+        </w:tc>
+        <w:tc>
+          <w:tcPr>
+            <w:tcW w:type="dxa" w:w="2422"/>
+            <w:shd w:val="clear" w:color="auto" w:fill="B8B3D6"/>
+            <w:tcBorders>
+              <w:top w:val="single" w:sz="4" w:space="0" w:color="CBCBCB"/>
+              <w:left w:val="single" w:sz="4" w:space="0" w:color="CBCBCB"/>
+              <w:bottom w:val="single" w:sz="4" w:space="0" w:color="CBCBCB"/>
+              <w:right w:val="single" w:sz="4" w:space="0" w:color="CBCBCB"/>
+            </w:tcBorders>
+          </w:tcPr>
+          <w:p>
+            <w:r>
+              <w:rPr>
+                <w:sz w:val="20"/>
+              </w:rPr>
+              <w:t>Project Manager</w:t>
             </w:r>
           </w:p>
         </w:tc>

</xml_diff>